<commit_message>
Final Project 0 Push
</commit_message>
<xml_diff>
--- a/Project 0/Reports/Roll Report 0.docx
+++ b/Project 0/Reports/Roll Report 0.docx
@@ -99,25 +99,37 @@
         <w:rPr>
           <w:rFonts w:ascii="Arial" w:hAnsi="Arial" w:cs="Arial"/>
         </w:rPr>
-        <w:t>, with the time of measurement being recorded both by an electronic monitoring cap (cap time), which houses the SPIT booklet throughout the day, and manually by participants in the booklet (booklet time). To evaluate efficacy, we analyzed</w:t>
-      </w:r>
-      <w:r>
-        <w:rPr>
-          <w:rFonts w:ascii="Arial" w:hAnsi="Arial" w:cs="Arial"/>
-        </w:rPr>
-        <w:t xml:space="preserve"> </w:t>
-      </w:r>
-      <w:r>
-        <w:rPr>
-          <w:rFonts w:ascii="Arial" w:hAnsi="Arial" w:cs="Arial"/>
-        </w:rPr>
-        <w:t xml:space="preserve">internal consistency of timing (if on average, cap and booklet times were similar) and treatment adherence (the proportion of participants </w:t>
-      </w:r>
-      <w:r>
-        <w:rPr>
-          <w:rFonts w:ascii="Arial" w:hAnsi="Arial" w:cs="Arial"/>
-        </w:rPr>
-        <w:t>completing measurements on time). We also analyzed whether there is an association between time since wake and cortisol and DHEA levels and whether this association follows the established diurnal trends.</w:t>
+        <w:t xml:space="preserve">, with the time of measurement being recorded both by an electronic monitoring cap (cap time), which houses the SPIT booklet throughout the day, and manually by participants in the booklet (booklet time). To evaluate efficacy, internal consistency of timing (if on average, cap and booklet times were similar) and treatment adherence (the proportion of participants </w:t>
+      </w:r>
+      <w:r>
+        <w:rPr>
+          <w:rFonts w:ascii="Arial" w:hAnsi="Arial" w:cs="Arial"/>
+        </w:rPr>
+        <w:t>completing measurements on time)</w:t>
+      </w:r>
+      <w:r>
+        <w:rPr>
+          <w:rFonts w:ascii="Arial" w:hAnsi="Arial" w:cs="Arial"/>
+        </w:rPr>
+        <w:t xml:space="preserve"> were analyzed</w:t>
+      </w:r>
+      <w:r>
+        <w:rPr>
+          <w:rFonts w:ascii="Arial" w:hAnsi="Arial" w:cs="Arial"/>
+        </w:rPr>
+        <w:t xml:space="preserve">. </w:t>
+      </w:r>
+      <w:r>
+        <w:rPr>
+          <w:rFonts w:ascii="Arial" w:hAnsi="Arial" w:cs="Arial"/>
+        </w:rPr>
+        <w:t xml:space="preserve">Also, this project seeks to determine whether there is </w:t>
+      </w:r>
+      <w:r>
+        <w:rPr>
+          <w:rFonts w:ascii="Arial" w:hAnsi="Arial" w:cs="Arial"/>
+        </w:rPr>
+        <w:t>an association between time since wake and cortisol and DHEA levels and whether this association follows the established diurnal trends.</w:t>
       </w:r>
     </w:p>
     <w:p>
@@ -220,7 +232,31 @@
         <w:rPr>
           <w:rFonts w:ascii="Arial" w:hAnsi="Arial" w:cs="Arial"/>
         </w:rPr>
-        <w:t xml:space="preserve"> Furthermore, cap or book time was selected for use in the remainder of the analysis based on its agreement and levels of missingness. </w:t>
+        <w:t xml:space="preserve"> Furthermore, </w:t>
+      </w:r>
+      <w:r>
+        <w:rPr>
+          <w:rFonts w:ascii="Arial" w:hAnsi="Arial" w:cs="Arial"/>
+        </w:rPr>
+        <w:t xml:space="preserve">one of </w:t>
+      </w:r>
+      <w:r>
+        <w:rPr>
+          <w:rFonts w:ascii="Arial" w:hAnsi="Arial" w:cs="Arial"/>
+        </w:rPr>
+        <w:t xml:space="preserve">cap or book time was selected for use in the remainder of the analysis based on its </w:t>
+      </w:r>
+      <w:r>
+        <w:rPr>
+          <w:rFonts w:ascii="Arial" w:hAnsi="Arial" w:cs="Arial"/>
+        </w:rPr>
+        <w:t xml:space="preserve">relative </w:t>
+      </w:r>
+      <w:r>
+        <w:rPr>
+          <w:rFonts w:ascii="Arial" w:hAnsi="Arial" w:cs="Arial"/>
+        </w:rPr>
+        <w:t xml:space="preserve">agreement and levels of missingness. </w:t>
       </w:r>
     </w:p>
     <w:p>
@@ -266,7 +302,14 @@
         <w:rPr>
           <w:rFonts w:ascii="Arial" w:hAnsi="Arial" w:cs="Arial"/>
         </w:rPr>
-        <w:t xml:space="preserve"> as established in the literature. This allow</w:t>
+        <w:t xml:space="preserve"> </w:t>
+      </w:r>
+      <w:r>
+        <w:rPr>
+          <w:rFonts w:ascii="Arial" w:hAnsi="Arial" w:cs="Arial"/>
+        </w:rPr>
+        <w:lastRenderedPageBreak/>
+        <w:t>as established in the literature. This allow</w:t>
       </w:r>
       <w:r>
         <w:rPr>
@@ -278,14 +321,7 @@
         <w:rPr>
           <w:rFonts w:ascii="Arial" w:hAnsi="Arial" w:cs="Arial"/>
         </w:rPr>
-        <w:t xml:space="preserve"> predictions to vary before and after the knot </w:t>
-      </w:r>
-      <w:r>
-        <w:rPr>
-          <w:rFonts w:ascii="Arial" w:hAnsi="Arial" w:cs="Arial"/>
-        </w:rPr>
-        <w:lastRenderedPageBreak/>
-        <w:t xml:space="preserve">point and </w:t>
+        <w:t xml:space="preserve"> predictions to vary before and after the knot point and </w:t>
       </w:r>
       <w:r>
         <w:rPr>
@@ -405,7 +441,19 @@
         <w:rPr>
           <w:rFonts w:ascii="Arial" w:hAnsi="Arial" w:cs="Arial"/>
         </w:rPr>
-        <w:t xml:space="preserve">on the linearly transformed quantities using the </w:t>
+        <w:t xml:space="preserve">on the linearly transformed </w:t>
+      </w:r>
+      <w:r>
+        <w:rPr>
+          <w:rFonts w:ascii="Arial" w:hAnsi="Arial" w:cs="Arial"/>
+        </w:rPr>
+        <w:t>estimates</w:t>
+      </w:r>
+      <w:r>
+        <w:rPr>
+          <w:rFonts w:ascii="Arial" w:hAnsi="Arial" w:cs="Arial"/>
+        </w:rPr>
+        <w:t xml:space="preserve"> using the </w:t>
       </w:r>
       <w:r>
         <w:rPr>
@@ -417,7 +465,19 @@
         <w:rPr>
           <w:rFonts w:ascii="Arial" w:hAnsi="Arial" w:cs="Arial"/>
         </w:rPr>
-        <w:t xml:space="preserve">The alpha threshold to determine significance will be 0.05 across all analyses. </w:t>
+        <w:t xml:space="preserve">The alpha threshold to determine significance </w:t>
+      </w:r>
+      <w:r>
+        <w:rPr>
+          <w:rFonts w:ascii="Arial" w:hAnsi="Arial" w:cs="Arial"/>
+        </w:rPr>
+        <w:t>was</w:t>
+      </w:r>
+      <w:r>
+        <w:rPr>
+          <w:rFonts w:ascii="Arial" w:hAnsi="Arial" w:cs="Arial"/>
+        </w:rPr>
+        <w:t xml:space="preserve"> 0.05 across all analyses. </w:t>
       </w:r>
       <w:r>
         <w:rPr>
@@ -457,7 +517,31 @@
         <w:rPr>
           <w:rFonts w:ascii="Arial" w:hAnsi="Arial" w:cs="Arial"/>
         </w:rPr>
-        <w:t>After applying exclusion criteria, 10% of booklet times were missing while 17% of cap times were missing out of the 372 total samples expected. 84% of individuals had complete records on the cap, 91% had complete records in the booklet, and 77% on both (Table 1). There</w:t>
+        <w:t xml:space="preserve">After applying exclusion criteria, 10% of booklet times were missing while 17% of cap times were missing out of the 372 total samples expected. 84% of individuals had complete records </w:t>
+      </w:r>
+      <w:r>
+        <w:rPr>
+          <w:rFonts w:ascii="Arial" w:hAnsi="Arial" w:cs="Arial"/>
+        </w:rPr>
+        <w:t>i</w:t>
+      </w:r>
+      <w:r>
+        <w:rPr>
+          <w:rFonts w:ascii="Arial" w:hAnsi="Arial" w:cs="Arial"/>
+        </w:rPr>
+        <w:t xml:space="preserve">n the </w:t>
+      </w:r>
+      <w:r>
+        <w:rPr>
+          <w:rFonts w:ascii="Arial" w:hAnsi="Arial" w:cs="Arial"/>
+        </w:rPr>
+        <w:t xml:space="preserve">electronic </w:t>
+      </w:r>
+      <w:r>
+        <w:rPr>
+          <w:rFonts w:ascii="Arial" w:hAnsi="Arial" w:cs="Arial"/>
+        </w:rPr>
+        <w:t>cap, 91% had complete records in the booklet, and 77% on both (Table 1). There</w:t>
       </w:r>
       <w:r>
         <w:rPr>
@@ -559,7 +643,49 @@
           <w:rFonts w:ascii="Arial" w:hAnsi="Arial" w:cs="Arial"/>
           <w:bCs/>
         </w:rPr>
-        <w:t xml:space="preserve"> there is a statistically significant predicted decrease in cortisol of 6.10% for every subsequent half hour (95% CI: (-7.27%, -4.92%), p &lt; 0.001) (Table 2, Figure 3). For DHEA levels, there is a statistically significant predicted decrease of 43.60% in the first 30 minutes after waking (95% CI: (-54.20%, -30.55%), p &lt; 0.001). After 30 minutes, there is a statistically significant predicted decrease in DHEA of 4.26% in each subsequent half hour (95% CI: (-5.26%, -3.24%), p &lt; 0.001) (Table 2, Figure 4).   </w:t>
+        <w:t xml:space="preserve"> there is a statistically significant predicted </w:t>
+      </w:r>
+      <w:r>
+        <w:rPr>
+          <w:rFonts w:ascii="Arial" w:hAnsi="Arial" w:cs="Arial"/>
+          <w:bCs/>
+        </w:rPr>
+        <w:t xml:space="preserve">average </w:t>
+      </w:r>
+      <w:r>
+        <w:rPr>
+          <w:rFonts w:ascii="Arial" w:hAnsi="Arial" w:cs="Arial"/>
+          <w:bCs/>
+        </w:rPr>
+        <w:t xml:space="preserve">decrease in cortisol of 6.10% for every subsequent half hour (95% CI: (-7.27%, -4.92%), p &lt; 0.001) (Table 2, Figure 3). For DHEA levels, there is a statistically significant predicted </w:t>
+      </w:r>
+      <w:r>
+        <w:rPr>
+          <w:rFonts w:ascii="Arial" w:hAnsi="Arial" w:cs="Arial"/>
+          <w:bCs/>
+        </w:rPr>
+        <w:t xml:space="preserve">average </w:t>
+      </w:r>
+      <w:r>
+        <w:rPr>
+          <w:rFonts w:ascii="Arial" w:hAnsi="Arial" w:cs="Arial"/>
+          <w:bCs/>
+        </w:rPr>
+        <w:t xml:space="preserve">decrease of 43.60% in the first 30 minutes after waking (95% CI: (-54.20%, -30.55%), p &lt; 0.001). After 30 minutes, there is a statistically significant predicted </w:t>
+      </w:r>
+      <w:r>
+        <w:rPr>
+          <w:rFonts w:ascii="Arial" w:hAnsi="Arial" w:cs="Arial"/>
+          <w:bCs/>
+        </w:rPr>
+        <w:t xml:space="preserve">average </w:t>
+      </w:r>
+      <w:r>
+        <w:rPr>
+          <w:rFonts w:ascii="Arial" w:hAnsi="Arial" w:cs="Arial"/>
+          <w:bCs/>
+        </w:rPr>
+        <w:t xml:space="preserve">decrease in DHEA of 4.26% in each subsequent half hour (95% CI: (-5.26%, -3.24%), p &lt; 0.001) (Table 2, Figure 4).   </w:t>
       </w:r>
     </w:p>
     <w:p>
@@ -593,7 +719,7 @@
           <w:rFonts w:ascii="Arial" w:hAnsi="Arial" w:cs="Arial"/>
           <w:bCs/>
         </w:rPr>
-        <w:t xml:space="preserve">The SPIT test for cortisol and DHEA levels matches established trends of diurnal variation of these hormones, with cortisol levels predicted to peak about half an hour after wake and DHEA levels predicted to be highest at wake with both values declining steadily after the first 30 minutes awake. The timekeeping system for the SPIT test is highly internally consistent, with minimal deviations between cap and booklet time. However, cap time is more prone to missing data than booklet time, indicating that </w:t>
+        <w:t xml:space="preserve">The SPIT test for cortisol and DHEA levels matches established trends of diurnal variation of these hormones, with cortisol levels predicted to peak about half an hour after wake and DHEA levels predicted to be highest at wake with both values declining steadily after the first 30 minutes awake. The timekeeping system for the SPIT test is highly internally consistent, with minimal deviations between cap and booklet time. </w:t>
       </w:r>
       <w:r>
         <w:rPr>
@@ -601,7 +727,7 @@
           <w:bCs/>
         </w:rPr>
         <w:lastRenderedPageBreak/>
-        <w:t>improvements could be made to use of the electronic cap. Adherence is strong in the early samples but diminishes over the course of the day</w:t>
+        <w:t>However, cap time is more prone to missing data than booklet time, indicating that improvements could be made to use of the electronic cap. Adherence is strong in the early samples but diminishes over the course of the day</w:t>
       </w:r>
       <w:r>
         <w:rPr>
@@ -609,6 +735,13 @@
           <w:bCs/>
         </w:rPr>
         <w:t xml:space="preserve">; this means that estimates near the end of the day could </w:t>
+      </w:r>
+      <w:r>
+        <w:rPr>
+          <w:rFonts w:ascii="Arial" w:hAnsi="Arial" w:cs="Arial"/>
+          <w:bCs/>
+        </w:rPr>
+        <w:t>be more unstable than those closer to wake time. The modelling strategy in this analysis accounted for correlation between repeated measures within a participant in each day but did not account for repeated measures within a participant on consecutive days. This choice improved model simplicity and interpretability but could lead to deflated standard errors and bias if there is high serial correlation between participants on consecutive days. Additionally, this study uses only 31 participants with unknown demographic characteristics—to ensure that the SPIT test framework functions adequately, a larger trial with a diverse patient population must be conducted.</w:t>
       </w:r>
     </w:p>
     <w:p>
@@ -3279,6 +3412,34 @@
                                 <w:szCs w:val="16"/>
                               </w:rPr>
                               <w:t xml:space="preserve"> 0.99</w:t>
+                            </w:r>
+                          </w:p>
+                          <w:p>
+                            <w:pPr>
+                              <w:pStyle w:val="NoSpacing"/>
+                              <w:rPr>
+                                <w:rFonts w:ascii="Arial" w:hAnsi="Arial" w:cs="Arial"/>
+                                <w:sz w:val="16"/>
+                                <w:szCs w:val="16"/>
+                              </w:rPr>
+                            </w:pPr>
+                            <w:r>
+                              <w:rPr>
+                                <w:rFonts w:ascii="Arial" w:hAnsi="Arial" w:cs="Arial"/>
+                                <w:b/>
+                                <w:bCs/>
+                                <w:sz w:val="16"/>
+                                <w:szCs w:val="16"/>
+                              </w:rPr>
+                              <w:t>Random Intercept SD:</w:t>
+                            </w:r>
+                            <w:r>
+                              <w:rPr>
+                                <w:rFonts w:ascii="Arial" w:hAnsi="Arial" w:cs="Arial"/>
+                                <w:sz w:val="16"/>
+                                <w:szCs w:val="16"/>
+                              </w:rPr>
+                              <w:t xml:space="preserve"> 6 </w:t>
                             </w:r>
                           </w:p>
                           <w:p>
@@ -3418,6 +3579,34 @@
                           <w:sz w:val="16"/>
                           <w:szCs w:val="16"/>
                         </w:rPr>
+                        <w:t>Random Intercept SD:</w:t>
+                      </w:r>
+                      <w:r>
+                        <w:rPr>
+                          <w:rFonts w:ascii="Arial" w:hAnsi="Arial" w:cs="Arial"/>
+                          <w:sz w:val="16"/>
+                          <w:szCs w:val="16"/>
+                        </w:rPr>
+                        <w:t xml:space="preserve"> 6 </w:t>
+                      </w:r>
+                    </w:p>
+                    <w:p>
+                      <w:pPr>
+                        <w:pStyle w:val="NoSpacing"/>
+                        <w:rPr>
+                          <w:rFonts w:ascii="Arial" w:hAnsi="Arial" w:cs="Arial"/>
+                          <w:sz w:val="16"/>
+                          <w:szCs w:val="16"/>
+                        </w:rPr>
+                      </w:pPr>
+                      <w:r>
+                        <w:rPr>
+                          <w:rFonts w:ascii="Arial" w:hAnsi="Arial" w:cs="Arial"/>
+                          <w:b/>
+                          <w:bCs/>
+                          <w:sz w:val="16"/>
+                          <w:szCs w:val="16"/>
+                        </w:rPr>
                         <w:t>Correlation (Repeated Measures):</w:t>
                       </w:r>
                       <w:r>
@@ -5122,7 +5311,102 @@
         <w:t>, reflecting uncertainty in the estimated mean</w:t>
       </w:r>
     </w:p>
-    <w:p/>
+    <w:p>
+      <w:pPr>
+        <w:spacing w:after="160" w:line="278" w:lineRule="auto"/>
+        <w:rPr>
+          <w:rFonts w:ascii="Calibri" w:hAnsi="Calibri" w:cs="Calibri"/>
+        </w:rPr>
+      </w:pPr>
+      <w:r>
+        <w:rPr>
+          <w:rFonts w:ascii="Calibri" w:hAnsi="Calibri" w:cs="Calibri"/>
+        </w:rPr>
+        <w:br w:type="page"/>
+      </w:r>
+    </w:p>
+    <w:p>
+      <w:pPr>
+        <w:rPr>
+          <w:rFonts w:ascii="Arial" w:hAnsi="Arial" w:cs="Arial"/>
+          <w:b/>
+          <w:bCs/>
+          <w:u w:val="single"/>
+        </w:rPr>
+      </w:pPr>
+      <w:r>
+        <w:rPr>
+          <w:rFonts w:ascii="Arial" w:hAnsi="Arial" w:cs="Arial"/>
+          <w:b/>
+          <w:bCs/>
+          <w:u w:val="single"/>
+        </w:rPr>
+        <w:lastRenderedPageBreak/>
+        <w:t>Acknowledgements</w:t>
+      </w:r>
+    </w:p>
+    <w:p>
+      <w:pPr>
+        <w:rPr>
+          <w:rFonts w:ascii="Arial" w:hAnsi="Arial" w:cs="Arial"/>
+        </w:rPr>
+      </w:pPr>
+      <w:r>
+        <w:rPr>
+          <w:rFonts w:ascii="Arial" w:hAnsi="Arial" w:cs="Arial"/>
+        </w:rPr>
+        <w:t>Data and guidance were provided by Dr. Camille Moore. ChatGPT v5.2 was used to debug code throughout this assignment, specifically with plotting the predicted values on Figures 3 and 4.</w:t>
+      </w:r>
+    </w:p>
+    <w:p>
+      <w:pPr>
+        <w:rPr>
+          <w:rFonts w:ascii="Arial" w:hAnsi="Arial" w:cs="Arial"/>
+        </w:rPr>
+      </w:pPr>
+    </w:p>
+    <w:p>
+      <w:pPr>
+        <w:rPr>
+          <w:rFonts w:ascii="Arial" w:hAnsi="Arial" w:cs="Arial"/>
+          <w:b/>
+          <w:bCs/>
+          <w:u w:val="single"/>
+        </w:rPr>
+      </w:pPr>
+      <w:r>
+        <w:rPr>
+          <w:rFonts w:ascii="Arial" w:hAnsi="Arial" w:cs="Arial"/>
+          <w:b/>
+          <w:bCs/>
+          <w:u w:val="single"/>
+        </w:rPr>
+        <w:t>Reproducible Research</w:t>
+      </w:r>
+    </w:p>
+    <w:p>
+      <w:pPr>
+        <w:rPr>
+          <w:rFonts w:ascii="Arial" w:hAnsi="Arial" w:cs="Arial"/>
+        </w:rPr>
+      </w:pPr>
+      <w:hyperlink r:id="rId9" w:history="1">
+        <w:r>
+          <w:rPr>
+            <w:rStyle w:val="Hyperlink"/>
+            <w:rFonts w:ascii="Arial" w:hAnsi="Arial" w:cs="Arial"/>
+          </w:rPr>
+          <w:t>https://github.com/MarshallRoll/Advanced_Methods_Roll/tree/main/Project%200</w:t>
+        </w:r>
+      </w:hyperlink>
+    </w:p>
+    <w:p>
+      <w:pPr>
+        <w:rPr>
+          <w:rFonts w:ascii="Arial" w:hAnsi="Arial" w:cs="Arial"/>
+        </w:rPr>
+      </w:pPr>
+    </w:p>
     <w:sectPr>
       <w:pgSz w:w="12240" w:h="15840"/>
       <w:pgMar w:top="1440" w:right="1440" w:bottom="1440" w:left="1440" w:header="720" w:footer="720" w:gutter="0"/>
@@ -6255,6 +6539,29 @@
       <w14:ligatures w14:val="none"/>
     </w:rPr>
   </w:style>
+  <w:style w:type="character" w:styleId="Hyperlink">
+    <w:name w:val="Hyperlink"/>
+    <w:basedOn w:val="DefaultParagraphFont"/>
+    <w:uiPriority w:val="99"/>
+    <w:unhideWhenUsed/>
+    <w:rsid w:val="007E3E10"/>
+    <w:rPr>
+      <w:color w:val="467886" w:themeColor="hyperlink"/>
+      <w:u w:val="single"/>
+    </w:rPr>
+  </w:style>
+  <w:style w:type="character" w:styleId="UnresolvedMention">
+    <w:name w:val="Unresolved Mention"/>
+    <w:basedOn w:val="DefaultParagraphFont"/>
+    <w:uiPriority w:val="99"/>
+    <w:semiHidden/>
+    <w:unhideWhenUsed/>
+    <w:rsid w:val="007E3E10"/>
+    <w:rPr>
+      <w:color w:val="605E5C"/>
+      <w:shd w:val="clear" w:color="auto" w:fill="E1DFDD"/>
+    </w:rPr>
+  </w:style>
 </w:styles>
 </file>
 

</xml_diff>